<commit_message>
Implement Phase 4 S3 and CloudWatch modules with milestone screenshots.
Co-authored-by: Cursor <cursoragent@cursor.com>
</commit_message>
<xml_diff>
--- a/project-2-aws-infrastructure/docs/What is Implemented.docx
+++ b/project-2-aws-infrastructure/docs/What is Implemented.docx
@@ -81,15 +81,7 @@
         </w:numPr>
       </w:pPr>
       <w:r>
-        <w:t>Modules/</w:t>
-      </w:r>
-      <w:proofErr w:type="spellStart"/>
-      <w:r>
-        <w:t>alb</w:t>
-      </w:r>
-      <w:proofErr w:type="spellEnd"/>
-      <w:r>
-        <w:t xml:space="preserve"> - </w:t>
+        <w:t xml:space="preserve">Modules/alb - </w:t>
       </w:r>
       <w:r>
         <w:t>Public ALB, HTTP :80 listener, target group, ALB security group</w:t>
@@ -104,18 +96,13 @@
         </w:numPr>
       </w:pPr>
       <w:r>
-        <w:t>Modules/</w:t>
-      </w:r>
-      <w:proofErr w:type="spellStart"/>
-      <w:r>
-        <w:t>asg</w:t>
-      </w:r>
-      <w:proofErr w:type="spellEnd"/>
-      <w:r>
-        <w:t xml:space="preserve"> - </w:t>
+        <w:t xml:space="preserve">Modules/asg - </w:t>
       </w:r>
       <w:r>
         <w:t>Launch template (Amazon Linux 2023 + nginx user-data), ASG (desired 2), app SG (only from ALB), IAM/SSM profile, CPU target-tracking policy</w:t>
+      </w:r>
+      <w:r>
+        <w:t>.</w:t>
       </w:r>
     </w:p>
     <w:sectPr>

</xml_diff>